<commit_message>
bug report + AI gap analysis
</commit_message>
<xml_diff>
--- a/submission/reports/MainReport.docx
+++ b/submission/reports/MainReport.docx
@@ -7863,6 +7863,45 @@
           <w:rFonts w:ascii="Arial" w:hAnsi="Arial" w:cs="Arial"/>
         </w:rPr>
         <w:t xml:space="preserve"> ký tự của mật khẩu, chuỗi `Ab1@xyz` (7 ký tự) bắt buộc phải có đủ 1 hoa, 1 thường, 1 số, 1 ký tự đặc biệt. Nhờ đó, nếu hệ thống từ chối, ta biết chắc chắn nguyên nhân là do độ dài chứ không phải do thiếu loại ký tự.</w:t>
+      </w:r>
+    </w:p>
+    <w:p>
+      <w:pPr>
+        <w:pStyle w:val="Heading5"/>
+        <w:rPr>
+          <w:rFonts w:ascii="Arial" w:hAnsi="Arial" w:cs="Arial"/>
+          <w:b/>
+          <w:i/>
+          <w:sz w:val="20"/>
+          <w:szCs w:val="20"/>
+        </w:rPr>
+      </w:pPr>
+      <w:r>
+        <w:rPr>
+          <w:rFonts w:ascii="Arial" w:hAnsi="Arial" w:cs="Arial"/>
+          <w:b/>
+          <w:i/>
+          <w:sz w:val="20"/>
+          <w:szCs w:val="20"/>
+        </w:rPr>
+        <w:t>AI Gap Analysis</w:t>
+      </w:r>
+    </w:p>
+    <w:p>
+      <w:pPr>
+        <w:rPr>
+          <w:rFonts w:ascii="Arial" w:hAnsi="Arial" w:cs="Arial"/>
+          <w:sz w:val="20"/>
+          <w:szCs w:val="20"/>
+        </w:rPr>
+      </w:pPr>
+      <w:r>
+        <w:rPr>
+          <w:rFonts w:ascii="Arial" w:hAnsi="Arial" w:cs="Arial"/>
+          <w:sz w:val="20"/>
+          <w:szCs w:val="20"/>
+        </w:rPr>
+        <w:t>Đã kiểm tra, crosscheck và xác nhận AI Gemini đã cover rất tốt với các test case, không lọt bug.</w:t>
       </w:r>
     </w:p>
     <w:p>
@@ -8097,6 +8136,7 @@
                 <w:sz w:val="16"/>
                 <w:szCs w:val="16"/>
               </w:rPr>
+              <w:lastRenderedPageBreak/>
               <w:t>TC-FR07-001</w:t>
             </w:r>
           </w:p>
@@ -8169,16 +8209,7 @@
                 <w:sz w:val="16"/>
                 <w:szCs w:val="16"/>
               </w:rPr>
-              <w:t xml:space="preserve">Giỏ hàng hiển thị 1 dòng: Sản phẩm="iPhone 15 Pro Max", Đơn giá=30.000.000₫, Số lượng=1, Thành </w:t>
-            </w:r>
-            <w:r>
-              <w:rPr>
-                <w:rFonts w:ascii="Arial" w:hAnsi="Arial" w:cs="Arial"/>
-                <w:sz w:val="16"/>
-                <w:szCs w:val="16"/>
-              </w:rPr>
-              <w:lastRenderedPageBreak/>
-              <w:t>tiền=30.000.000₫. Nhãn Tổng cộng = 30.000.000₫</w:t>
+              <w:t>Giỏ hàng hiển thị 1 dòng: Sản phẩm="iPhone 15 Pro Max", Đơn giá=30.000.000₫, Số lượng=1, Thành tiền=30.000.000₫. Nhãn Tổng cộng = 30.000.000₫</w:t>
             </w:r>
           </w:p>
         </w:tc>
@@ -8202,7 +8233,6 @@
                 <w:sz w:val="16"/>
                 <w:szCs w:val="16"/>
               </w:rPr>
-              <w:lastRenderedPageBreak/>
               <w:t>Valid</w:t>
             </w:r>
           </w:p>
@@ -8232,7 +8262,6 @@
                 <w:sz w:val="16"/>
                 <w:szCs w:val="16"/>
               </w:rPr>
-              <w:lastRenderedPageBreak/>
               <w:t>TC-FR07-002</w:t>
             </w:r>
           </w:p>
@@ -10233,6 +10262,7 @@
                 <w:sz w:val="16"/>
                 <w:szCs w:val="16"/>
               </w:rPr>
+              <w:lastRenderedPageBreak/>
               <w:t>TC-FR07-018</w:t>
             </w:r>
           </w:p>
@@ -10358,7 +10388,6 @@
                 <w:sz w:val="16"/>
                 <w:szCs w:val="16"/>
               </w:rPr>
-              <w:lastRenderedPageBreak/>
               <w:t>TC-FR07-019</w:t>
             </w:r>
           </w:p>
@@ -11784,6 +11813,7 @@
           <w:sz w:val="20"/>
           <w:szCs w:val="20"/>
         </w:rPr>
+        <w:lastRenderedPageBreak/>
         <w:t>Base case (TC-FR07-001):</w:t>
       </w:r>
       <w:r>
@@ -11856,7 +11886,6 @@
           <w:sz w:val="20"/>
           <w:szCs w:val="20"/>
         </w:rPr>
-        <w:lastRenderedPageBreak/>
         <w:t>Bổ sung:</w:t>
       </w:r>
       <w:r>
@@ -13501,7 +13530,16 @@
                 <w:sz w:val="16"/>
                 <w:szCs w:val="16"/>
               </w:rPr>
-              <w:t>Hiển thị bảng danh sách gồm đúng 1 dòng sản phẩm, nhãn tổng tiền là "Tổng cộng".</w:t>
+              <w:t xml:space="preserve">Hiển thị bảng danh sách gồm đúng 1 dòng sản phẩm, nhãn tổng tiền </w:t>
+            </w:r>
+            <w:r>
+              <w:rPr>
+                <w:rFonts w:ascii="Arial" w:hAnsi="Arial" w:cs="Arial"/>
+                <w:sz w:val="16"/>
+                <w:szCs w:val="16"/>
+              </w:rPr>
+              <w:lastRenderedPageBreak/>
+              <w:t>là "Tổng cộng".</w:t>
             </w:r>
           </w:p>
         </w:tc>
@@ -13524,6 +13562,7 @@
                 <w:sz w:val="16"/>
                 <w:szCs w:val="16"/>
               </w:rPr>
+              <w:lastRenderedPageBreak/>
               <w:t>Valid</w:t>
             </w:r>
           </w:p>
@@ -13571,7 +13610,6 @@
           <w:sz w:val="20"/>
           <w:szCs w:val="20"/>
         </w:rPr>
-        <w:lastRenderedPageBreak/>
         <w:t>Explaination</w:t>
       </w:r>
     </w:p>
@@ -13925,6 +13963,45 @@
           <w:szCs w:val="20"/>
         </w:rPr>
         <w:t>` trong khi giữ nguyên các thông tin sản phẩm và trạng thái đăng nhập hợp lệ, giúp việc xác định nguyên nhân lỗi (nếu xảy ra) trở nên chính xác tuyệt đối.</w:t>
+      </w:r>
+    </w:p>
+    <w:p>
+      <w:pPr>
+        <w:pStyle w:val="Heading5"/>
+        <w:rPr>
+          <w:rFonts w:ascii="Arial" w:hAnsi="Arial" w:cs="Arial"/>
+          <w:b/>
+          <w:i/>
+          <w:sz w:val="20"/>
+          <w:szCs w:val="20"/>
+        </w:rPr>
+      </w:pPr>
+      <w:r>
+        <w:rPr>
+          <w:rFonts w:ascii="Arial" w:hAnsi="Arial" w:cs="Arial"/>
+          <w:b/>
+          <w:i/>
+          <w:sz w:val="20"/>
+          <w:szCs w:val="20"/>
+        </w:rPr>
+        <w:t>AI Gap Analysis</w:t>
+      </w:r>
+    </w:p>
+    <w:p>
+      <w:pPr>
+        <w:rPr>
+          <w:rFonts w:ascii="Arial" w:hAnsi="Arial" w:cs="Arial"/>
+          <w:sz w:val="20"/>
+          <w:szCs w:val="20"/>
+        </w:rPr>
+      </w:pPr>
+      <w:r>
+        <w:rPr>
+          <w:rFonts w:ascii="Arial" w:hAnsi="Arial" w:cs="Arial"/>
+          <w:sz w:val="20"/>
+          <w:szCs w:val="20"/>
+        </w:rPr>
+        <w:t>Đã kiểm tra, crosscheck và xác nhận AI Gemini đã cover rất tốt với các test case, không lọt bug.</w:t>
       </w:r>
     </w:p>
     <w:p>
@@ -14455,6 +14532,8 @@
               </w:rPr>
               <w:t>Invalid</w:t>
             </w:r>
+            <w:bookmarkStart w:id="1" w:name="_GoBack"/>
+            <w:bookmarkEnd w:id="1"/>
           </w:p>
         </w:tc>
       </w:tr>
@@ -14849,6 +14928,7 @@
                 <w:sz w:val="16"/>
                 <w:szCs w:val="16"/>
               </w:rPr>
+              <w:lastRenderedPageBreak/>
               <w:t>price: -100000</w:t>
             </w:r>
             <w:r>
@@ -14904,7 +14984,17 @@
                 <w:sz w:val="16"/>
                 <w:szCs w:val="16"/>
               </w:rPr>
-              <w:t>Hệ thống từ chối, trả về lỗi do giá không được phép là số âm.</w:t>
+              <w:lastRenderedPageBreak/>
+              <w:t xml:space="preserve">Hệ thống từ chối, trả về lỗi do giá không được phép là </w:t>
+            </w:r>
+            <w:r>
+              <w:rPr>
+                <w:rFonts w:ascii="Arial" w:hAnsi="Arial" w:cs="Arial"/>
+                <w:sz w:val="16"/>
+                <w:szCs w:val="16"/>
+              </w:rPr>
+              <w:lastRenderedPageBreak/>
+              <w:t>số âm.</w:t>
             </w:r>
           </w:p>
         </w:tc>
@@ -14927,6 +15017,7 @@
                 <w:sz w:val="16"/>
                 <w:szCs w:val="16"/>
               </w:rPr>
+              <w:lastRenderedPageBreak/>
               <w:t>Invalid</w:t>
             </w:r>
           </w:p>
@@ -14952,6 +15043,7 @@
                 <w:sz w:val="16"/>
                 <w:szCs w:val="16"/>
               </w:rPr>
+              <w:lastRenderedPageBreak/>
               <w:t>TC-FR15-006</w:t>
             </w:r>
           </w:p>
@@ -15197,16 +15289,7 @@
                 <w:sz w:val="16"/>
                 <w:szCs w:val="16"/>
               </w:rPr>
-              <w:t xml:space="preserve">Role: </w:t>
-            </w:r>
-            <w:r>
-              <w:rPr>
-                <w:rFonts w:ascii="Arial" w:hAnsi="Arial" w:cs="Arial"/>
-                <w:sz w:val="16"/>
-                <w:szCs w:val="16"/>
-              </w:rPr>
-              <w:lastRenderedPageBreak/>
-              <w:t>Admin</w:t>
+              <w:t>Role: Admin</w:t>
             </w:r>
           </w:p>
         </w:tc>
@@ -15229,7 +15312,6 @@
                 <w:sz w:val="16"/>
                 <w:szCs w:val="16"/>
               </w:rPr>
-              <w:lastRenderedPageBreak/>
               <w:t>Hệ thống từ chối do category_id không khớp với bất kỳ danh mục hợp lệ nào trong CSDL.</w:t>
             </w:r>
           </w:p>
@@ -15278,7 +15360,6 @@
                 <w:sz w:val="16"/>
                 <w:szCs w:val="16"/>
               </w:rPr>
-              <w:lastRenderedPageBreak/>
               <w:t>TC-FR15-008</w:t>
             </w:r>
           </w:p>
@@ -16436,6 +16517,7 @@
           <w:sz w:val="20"/>
           <w:szCs w:val="20"/>
         </w:rPr>
+        <w:lastRenderedPageBreak/>
         <w:t>Các tr</w:t>
       </w:r>
       <w:r>
@@ -16610,16 +16692,7 @@
                 <w:sz w:val="16"/>
                 <w:szCs w:val="16"/>
               </w:rPr>
-              <w:t xml:space="preserve">Mốc biên </w:t>
-            </w:r>
-            <w:r>
-              <w:rPr>
-                <w:rFonts w:ascii="Arial" w:hAnsi="Arial" w:cs="Arial"/>
-                <w:sz w:val="16"/>
-                <w:szCs w:val="16"/>
-              </w:rPr>
-              <w:lastRenderedPageBreak/>
-              <w:t>(Boundary Point)</w:t>
+              <w:t>Mốc biên (Boundary Point)</w:t>
             </w:r>
           </w:p>
         </w:tc>
@@ -16642,7 +16715,6 @@
                 <w:sz w:val="16"/>
                 <w:szCs w:val="16"/>
               </w:rPr>
-              <w:lastRenderedPageBreak/>
               <w:t>Dữ liệu đầu vào (Input Data)</w:t>
             </w:r>
           </w:p>
@@ -16666,16 +16738,7 @@
                 <w:sz w:val="16"/>
                 <w:szCs w:val="16"/>
               </w:rPr>
-              <w:t xml:space="preserve">Kết quả mong đợi </w:t>
-            </w:r>
-            <w:r>
-              <w:rPr>
-                <w:rFonts w:ascii="Arial" w:hAnsi="Arial" w:cs="Arial"/>
-                <w:sz w:val="16"/>
-                <w:szCs w:val="16"/>
-              </w:rPr>
-              <w:lastRenderedPageBreak/>
-              <w:t>(Expected Result)</w:t>
+              <w:t>Kết quả mong đợi (Expected Result)</w:t>
             </w:r>
           </w:p>
         </w:tc>
@@ -16698,17 +16761,7 @@
                 <w:sz w:val="16"/>
                 <w:szCs w:val="16"/>
               </w:rPr>
-              <w:lastRenderedPageBreak/>
-              <w:t xml:space="preserve">Loại </w:t>
-            </w:r>
-            <w:r>
-              <w:rPr>
-                <w:rFonts w:ascii="Arial" w:hAnsi="Arial" w:cs="Arial"/>
-                <w:sz w:val="16"/>
-                <w:szCs w:val="16"/>
-              </w:rPr>
-              <w:lastRenderedPageBreak/>
-              <w:t>(Type)</w:t>
+              <w:t>Loại (Type)</w:t>
             </w:r>
           </w:p>
         </w:tc>
@@ -16733,7 +16786,6 @@
                 <w:sz w:val="16"/>
                 <w:szCs w:val="16"/>
               </w:rPr>
-              <w:lastRenderedPageBreak/>
               <w:t>BVA-FR15-01</w:t>
             </w:r>
           </w:p>
@@ -18691,6 +18743,7 @@
           <w:sz w:val="20"/>
           <w:szCs w:val="20"/>
         </w:rPr>
+        <w:lastRenderedPageBreak/>
         <w:t xml:space="preserve">  - Trường `name` có biên độ dài ký tự</w:t>
       </w:r>
       <w:r>
@@ -18937,6 +18990,45 @@
     </w:p>
     <w:p>
       <w:pPr>
+        <w:pStyle w:val="Heading5"/>
+        <w:rPr>
+          <w:rFonts w:ascii="Arial" w:hAnsi="Arial" w:cs="Arial"/>
+          <w:b/>
+          <w:i/>
+          <w:sz w:val="20"/>
+          <w:szCs w:val="20"/>
+        </w:rPr>
+      </w:pPr>
+      <w:r>
+        <w:rPr>
+          <w:rFonts w:ascii="Arial" w:hAnsi="Arial" w:cs="Arial"/>
+          <w:b/>
+          <w:i/>
+          <w:sz w:val="20"/>
+          <w:szCs w:val="20"/>
+        </w:rPr>
+        <w:t>AI Gap Analysis</w:t>
+      </w:r>
+    </w:p>
+    <w:p>
+      <w:pPr>
+        <w:rPr>
+          <w:rFonts w:ascii="Arial" w:hAnsi="Arial" w:cs="Arial"/>
+          <w:sz w:val="20"/>
+          <w:szCs w:val="20"/>
+        </w:rPr>
+      </w:pPr>
+      <w:r>
+        <w:rPr>
+          <w:rFonts w:ascii="Arial" w:hAnsi="Arial" w:cs="Arial"/>
+          <w:sz w:val="20"/>
+          <w:szCs w:val="20"/>
+        </w:rPr>
+        <w:t>Đã kiểm tra, crosscheck và xác nhận AI Gemini đã cover rất tốt với các test case, không lọt bug.</w:t>
+      </w:r>
+    </w:p>
+    <w:p>
+      <w:pPr>
         <w:pStyle w:val="Heading4"/>
         <w:rPr>
           <w:rFonts w:ascii="Arial" w:hAnsi="Arial" w:cs="Arial"/>
@@ -18952,19 +19044,7 @@
         <w:rPr>
           <w:rFonts w:ascii="Arial" w:hAnsi="Arial" w:cs="Arial"/>
         </w:rPr>
-        <w:t>01 – Mobile App</w:t>
-      </w:r>
-      <w:r>
-        <w:rPr>
-          <w:rFonts w:ascii="Arial" w:hAnsi="Arial" w:cs="Arial"/>
-        </w:rPr>
-        <w:t xml:space="preserve"> – </w:t>
-      </w:r>
-      <w:r>
-        <w:rPr>
-          <w:rFonts w:ascii="Arial" w:hAnsi="Arial" w:cs="Arial"/>
-        </w:rPr>
-        <w:t>Account registration</w:t>
+        <w:t>01 – Mobile App – Account registration</w:t>
       </w:r>
     </w:p>
     <w:p>
@@ -19686,6 +19766,7 @@
                 <w:sz w:val="16"/>
                 <w:szCs w:val="16"/>
               </w:rPr>
+              <w:lastRenderedPageBreak/>
               <w:t>confirmPassword: "Admin123!"</w:t>
             </w:r>
           </w:p>
@@ -19709,7 +19790,17 @@
                 <w:sz w:val="16"/>
                 <w:szCs w:val="16"/>
               </w:rPr>
-              <w:t>Hiển thị lỗi yêu cầu nhập địa chỉ Email, không cho phép gửi request.</w:t>
+              <w:lastRenderedPageBreak/>
+              <w:t xml:space="preserve">Hiển thị lỗi yêu cầu nhập </w:t>
+            </w:r>
+            <w:r>
+              <w:rPr>
+                <w:rFonts w:ascii="Arial" w:hAnsi="Arial" w:cs="Arial"/>
+                <w:sz w:val="16"/>
+                <w:szCs w:val="16"/>
+              </w:rPr>
+              <w:lastRenderedPageBreak/>
+              <w:t>địa chỉ Email, không cho phép gửi request.</w:t>
             </w:r>
           </w:p>
         </w:tc>
@@ -19732,6 +19823,7 @@
                 <w:sz w:val="16"/>
                 <w:szCs w:val="16"/>
               </w:rPr>
+              <w:lastRenderedPageBreak/>
               <w:t>Invalid</w:t>
             </w:r>
           </w:p>
@@ -19757,6 +19849,7 @@
                 <w:sz w:val="16"/>
                 <w:szCs w:val="16"/>
               </w:rPr>
+              <w:lastRenderedPageBreak/>
               <w:t>TC-MOB-REG-05</w:t>
             </w:r>
           </w:p>
@@ -20202,7 +20295,6 @@
                 <w:sz w:val="16"/>
                 <w:szCs w:val="16"/>
               </w:rPr>
-              <w:lastRenderedPageBreak/>
               <w:t>TC-MOB-REG-08</w:t>
             </w:r>
           </w:p>
@@ -21404,16 +21496,7 @@
           <w:sz w:val="20"/>
           <w:szCs w:val="20"/>
         </w:rPr>
-        <w:t>1. Phân tích miền giá trị</w:t>
-      </w:r>
-      <w:r>
-        <w:rPr>
-          <w:rFonts w:ascii="Arial" w:hAnsi="Arial" w:cs="Arial"/>
-          <w:b/>
-          <w:sz w:val="20"/>
-          <w:szCs w:val="20"/>
-        </w:rPr>
-        <w:t xml:space="preserve"> riêng cho Mobile:</w:t>
+        <w:t>1. Phân tích miền giá trị riêng cho Mobile:</w:t>
       </w:r>
     </w:p>
     <w:p>
@@ -21513,15 +21596,7 @@
           <w:sz w:val="20"/>
           <w:szCs w:val="20"/>
         </w:rPr>
-        <w:t xml:space="preserve"> Phân tách mật khẩu thành 5 điều kiện con độc lập để phát hiện lập trình viên thiếu sót điều kiệ</w:t>
-      </w:r>
-      <w:r>
-        <w:rPr>
-          <w:rFonts w:ascii="Arial" w:hAnsi="Arial" w:cs="Arial"/>
-          <w:sz w:val="20"/>
-          <w:szCs w:val="20"/>
-        </w:rPr>
-        <w:t>n Regex nào.</w:t>
+        <w:t xml:space="preserve"> Phân tách mật khẩu thành 5 điều kiện con độc lập để phát hiện lập trình viên thiếu sót điều kiện Regex nào.</w:t>
       </w:r>
     </w:p>
     <w:p>
@@ -21550,16 +21625,7 @@
           <w:sz w:val="20"/>
           <w:szCs w:val="20"/>
         </w:rPr>
-        <w:t>2. Phát hiện các sai lệch nghiêm trọng giữa Mobile App Code và Đặc tả F</w:t>
-      </w:r>
-      <w:r>
-        <w:rPr>
-          <w:rFonts w:ascii="Arial" w:hAnsi="Arial" w:cs="Arial"/>
-          <w:b/>
-          <w:sz w:val="20"/>
-          <w:szCs w:val="20"/>
-        </w:rPr>
-        <w:t>R-01:</w:t>
+        <w:t>2. Phát hiện các sai lệch nghiêm trọng giữa Mobile App Code và Đặc tả FR-01:</w:t>
       </w:r>
     </w:p>
     <w:p>
@@ -21585,15 +21651,7 @@
           <w:sz w:val="20"/>
           <w:szCs w:val="20"/>
         </w:rPr>
-        <w:t>THIẾU HOÀN TOÀN TRƯỜNG "XÁC NHẬN MẬT KHẨ</w:t>
-      </w:r>
-      <w:r>
-        <w:rPr>
-          <w:rFonts w:ascii="Arial" w:hAnsi="Arial" w:cs="Arial"/>
-          <w:sz w:val="20"/>
-          <w:szCs w:val="20"/>
-        </w:rPr>
-        <w:t>U":</w:t>
+        <w:t>THIẾU HOÀN TOÀN TRƯỜNG "XÁC NHẬN MẬT KHẨU":</w:t>
       </w:r>
       <w:r>
         <w:rPr>
@@ -21705,15 +21763,7 @@
           <w:sz w:val="20"/>
           <w:szCs w:val="20"/>
         </w:rPr>
-        <w:t xml:space="preserve"> test case `TC-MOB-REG-12` và `TC-MOB-REG-13` sẽ phát hiệ</w:t>
-      </w:r>
-      <w:r>
-        <w:rPr>
-          <w:rFonts w:ascii="Arial" w:hAnsi="Arial" w:cs="Arial"/>
-          <w:sz w:val="20"/>
-          <w:szCs w:val="20"/>
-        </w:rPr>
-        <w:t>n ngay Bug này.</w:t>
+        <w:t xml:space="preserve"> test case `TC-MOB-REG-12` và `TC-MOB-REG-13` sẽ phát hiện ngay Bug này.</w:t>
       </w:r>
       <w:r>
         <w:rPr>
@@ -21739,6 +21789,7 @@
           <w:sz w:val="20"/>
           <w:szCs w:val="20"/>
         </w:rPr>
+        <w:lastRenderedPageBreak/>
         <w:t>-</w:t>
       </w:r>
       <w:r>
@@ -21833,15 +21884,7 @@
           <w:sz w:val="20"/>
           <w:szCs w:val="20"/>
         </w:rPr>
-        <w:t>SAI TẬP KÝ TỰ ĐẶC BIỆT CỦA MẬT KHẨ</w:t>
-      </w:r>
-      <w:r>
-        <w:rPr>
-          <w:rFonts w:ascii="Arial" w:hAnsi="Arial" w:cs="Arial"/>
-          <w:sz w:val="20"/>
-          <w:szCs w:val="20"/>
-        </w:rPr>
-        <w:t>U:</w:t>
+        <w:t>SAI TẬP KÝ TỰ ĐẶC BIỆT CỦA MẬT KHẨU:</w:t>
       </w:r>
       <w:r>
         <w:rPr>
@@ -21911,7 +21954,6 @@
           <w:sz w:val="20"/>
           <w:szCs w:val="20"/>
         </w:rPr>
-        <w:lastRenderedPageBreak/>
         <w:t xml:space="preserve">   - Nhưng mã nguồn Mobile sử dụng Regex `[^A-Za-z\</w:t>
       </w:r>
       <w:proofErr w:type="gramStart"/>
@@ -21930,15 +21972,7 @@
           <w:sz w:val="20"/>
           <w:szCs w:val="20"/>
         </w:rPr>
-        <w:t xml:space="preserve"> (chấp nhận mọi ký tự ngoài chữ và số, kể cả dấu cách, emoji, dấu gạch nố</w:t>
-      </w:r>
-      <w:r>
-        <w:rPr>
-          <w:rFonts w:ascii="Arial" w:hAnsi="Arial" w:cs="Arial"/>
-          <w:sz w:val="20"/>
-          <w:szCs w:val="20"/>
-        </w:rPr>
-        <w:t>i).</w:t>
+        <w:t xml:space="preserve"> (chấp nhận mọi ký tự ngoài chữ và số, kể cả dấu cách, emoji, dấu gạch nối).</w:t>
       </w:r>
     </w:p>
     <w:p>
@@ -21967,16 +22001,7 @@
           <w:sz w:val="20"/>
           <w:szCs w:val="20"/>
         </w:rPr>
-        <w:t>3. Đánh giá tính hữu ích của kỹ thuậ</w:t>
-      </w:r>
-      <w:r>
-        <w:rPr>
-          <w:rFonts w:ascii="Arial" w:hAnsi="Arial" w:cs="Arial"/>
-          <w:b/>
-          <w:sz w:val="20"/>
-          <w:szCs w:val="20"/>
-        </w:rPr>
-        <w:t>t Domain Testing:</w:t>
+        <w:t>3. Đánh giá tính hữu ích của kỹ thuật Domain Testing:</w:t>
       </w:r>
     </w:p>
     <w:p>
@@ -24355,7 +24380,16 @@
                 <w:sz w:val="16"/>
                 <w:szCs w:val="16"/>
               </w:rPr>
-              <w:t>BVA-MOB-11</w:t>
+              <w:t>BVA-</w:t>
+            </w:r>
+            <w:r>
+              <w:rPr>
+                <w:rFonts w:ascii="Arial" w:hAnsi="Arial" w:cs="Arial"/>
+                <w:sz w:val="16"/>
+                <w:szCs w:val="16"/>
+              </w:rPr>
+              <w:lastRenderedPageBreak/>
+              <w:t>MOB-11</w:t>
             </w:r>
           </w:p>
         </w:tc>
@@ -24378,7 +24412,17 @@
                 <w:sz w:val="16"/>
                 <w:szCs w:val="16"/>
               </w:rPr>
-              <w:t>Số ký tự đặc biệt</w:t>
+              <w:lastRenderedPageBreak/>
+              <w:t xml:space="preserve">Số ký tự đặc </w:t>
+            </w:r>
+            <w:r>
+              <w:rPr>
+                <w:rFonts w:ascii="Arial" w:hAnsi="Arial" w:cs="Arial"/>
+                <w:sz w:val="16"/>
+                <w:szCs w:val="16"/>
+              </w:rPr>
+              <w:lastRenderedPageBreak/>
+              <w:t>biệt</w:t>
             </w:r>
           </w:p>
         </w:tc>
@@ -24401,6 +24445,7 @@
                 <w:sz w:val="16"/>
                 <w:szCs w:val="16"/>
               </w:rPr>
+              <w:lastRenderedPageBreak/>
               <w:t xml:space="preserve">    Min  </w:t>
             </w:r>
             <w:r>
@@ -24441,7 +24486,16 @@
                 <w:sz w:val="16"/>
                 <w:szCs w:val="16"/>
               </w:rPr>
-              <w:t xml:space="preserve"> ký tự ĐB)</w:t>
+              <w:t xml:space="preserve"> </w:t>
+            </w:r>
+            <w:r>
+              <w:rPr>
+                <w:rFonts w:ascii="Arial" w:hAnsi="Arial" w:cs="Arial"/>
+                <w:sz w:val="16"/>
+                <w:szCs w:val="16"/>
+              </w:rPr>
+              <w:lastRenderedPageBreak/>
+              <w:t>ký tự ĐB)</w:t>
             </w:r>
           </w:p>
         </w:tc>
@@ -24464,6 +24518,7 @@
                 <w:sz w:val="16"/>
                 <w:szCs w:val="16"/>
               </w:rPr>
+              <w:lastRenderedPageBreak/>
               <w:t>password: "Admin123@" (</w:t>
             </w:r>
             <w:r>
@@ -24519,7 +24574,16 @@
                 <w:sz w:val="16"/>
                 <w:szCs w:val="16"/>
               </w:rPr>
-              <w:t>Đạt chuẩn biên tối thiểu, đăng ký thành công.</w:t>
+              <w:t xml:space="preserve">Đạt chuẩn biên tối </w:t>
+            </w:r>
+            <w:r>
+              <w:rPr>
+                <w:rFonts w:ascii="Arial" w:hAnsi="Arial" w:cs="Arial"/>
+                <w:sz w:val="16"/>
+                <w:szCs w:val="16"/>
+              </w:rPr>
+              <w:lastRenderedPageBreak/>
+              <w:t>thiểu, đăng ký thành công.</w:t>
             </w:r>
           </w:p>
         </w:tc>
@@ -24542,6 +24606,7 @@
                 <w:sz w:val="16"/>
                 <w:szCs w:val="16"/>
               </w:rPr>
+              <w:lastRenderedPageBreak/>
               <w:t>Valid</w:t>
             </w:r>
           </w:p>
@@ -24567,6 +24632,7 @@
                 <w:sz w:val="16"/>
                 <w:szCs w:val="16"/>
               </w:rPr>
+              <w:lastRenderedPageBreak/>
               <w:t>BVA-MOB-12</w:t>
             </w:r>
           </w:p>
@@ -25171,16 +25237,7 @@
                 <w:sz w:val="16"/>
                 <w:szCs w:val="16"/>
               </w:rPr>
-              <w:t>BVA-</w:t>
-            </w:r>
-            <w:r>
-              <w:rPr>
-                <w:rFonts w:ascii="Arial" w:hAnsi="Arial" w:cs="Arial"/>
-                <w:sz w:val="16"/>
-                <w:szCs w:val="16"/>
-              </w:rPr>
-              <w:lastRenderedPageBreak/>
-              <w:t>MOB-15</w:t>
+              <w:t>BVA-MOB-15</w:t>
             </w:r>
           </w:p>
         </w:tc>
@@ -25203,7 +25260,6 @@
                 <w:sz w:val="16"/>
                 <w:szCs w:val="16"/>
               </w:rPr>
-              <w:lastRenderedPageBreak/>
               <w:t>name.length</w:t>
             </w:r>
           </w:p>
@@ -25251,16 +25307,7 @@
                 <w:sz w:val="16"/>
                 <w:szCs w:val="16"/>
               </w:rPr>
-              <w:t xml:space="preserve"> </w:t>
-            </w:r>
-            <w:r>
-              <w:rPr>
-                <w:rFonts w:ascii="Arial" w:hAnsi="Arial" w:cs="Arial"/>
-                <w:sz w:val="16"/>
-                <w:szCs w:val="16"/>
-              </w:rPr>
-              <w:lastRenderedPageBreak/>
-              <w:t>(</w:t>
+              <w:t xml:space="preserve"> (</w:t>
             </w:r>
             <w:r>
               <w:rPr>
@@ -25315,7 +25362,6 @@
                 <w:sz w:val="16"/>
                 <w:szCs w:val="16"/>
               </w:rPr>
-              <w:lastRenderedPageBreak/>
               <w:t>name: "An"</w:t>
             </w:r>
           </w:p>
@@ -25339,16 +25385,7 @@
                 <w:sz w:val="16"/>
                 <w:szCs w:val="16"/>
               </w:rPr>
-              <w:t xml:space="preserve">Đăng ký thành công </w:t>
-            </w:r>
-            <w:r>
-              <w:rPr>
-                <w:rFonts w:ascii="Arial" w:hAnsi="Arial" w:cs="Arial"/>
-                <w:sz w:val="16"/>
-                <w:szCs w:val="16"/>
-              </w:rPr>
-              <w:lastRenderedPageBreak/>
-              <w:t>với tên 2 ký tự thông thường.</w:t>
+              <w:t>Đăng ký thành công với tên 2 ký tự thông thường.</w:t>
             </w:r>
           </w:p>
         </w:tc>
@@ -25371,7 +25408,6 @@
                 <w:sz w:val="16"/>
                 <w:szCs w:val="16"/>
               </w:rPr>
-              <w:lastRenderedPageBreak/>
               <w:t>Valid</w:t>
             </w:r>
           </w:p>
@@ -25397,7 +25433,6 @@
                 <w:sz w:val="16"/>
                 <w:szCs w:val="16"/>
               </w:rPr>
-              <w:lastRenderedPageBreak/>
               <w:t>BVA-MOB-16</w:t>
             </w:r>
           </w:p>
@@ -25766,16 +25801,7 @@
           <w:sz w:val="20"/>
           <w:szCs w:val="20"/>
         </w:rPr>
-        <w:t>ờng minh và Biên ngầm đị</w:t>
-      </w:r>
-      <w:r>
-        <w:rPr>
-          <w:rFonts w:ascii="Arial" w:hAnsi="Arial" w:cs="Arial"/>
-          <w:b/>
-          <w:sz w:val="20"/>
-          <w:szCs w:val="20"/>
-        </w:rPr>
-        <w:t>nh:</w:t>
+        <w:t>ờng minh và Biên ngầm định:</w:t>
       </w:r>
     </w:p>
     <w:p>
@@ -25888,16 +25914,7 @@
           <w:sz w:val="20"/>
           <w:szCs w:val="20"/>
         </w:rPr>
-        <w:t>ớc 3: Lựa chọn mô hình 3-Val</w:t>
-      </w:r>
-      <w:r>
-        <w:rPr>
-          <w:rFonts w:ascii="Arial" w:hAnsi="Arial" w:cs="Arial"/>
-          <w:b/>
-          <w:sz w:val="20"/>
-          <w:szCs w:val="20"/>
-        </w:rPr>
-        <w:t>ue BVA:</w:t>
+        <w:t>ớc 3: Lựa chọn mô hình 3-Value BVA:</w:t>
       </w:r>
     </w:p>
     <w:p>
@@ -26050,17 +26067,7 @@
           <w:sz w:val="20"/>
           <w:szCs w:val="20"/>
         </w:rPr>
-        <w:t>+1=9</w:t>
-      </w:r>
-      <w:bookmarkStart w:id="1" w:name="_GoBack"/>
-      <w:bookmarkEnd w:id="1"/>
-      <w:r>
-        <w:rPr>
-          <w:rFonts w:ascii="Arial" w:hAnsi="Arial" w:cs="Arial"/>
-          <w:sz w:val="20"/>
-          <w:szCs w:val="20"/>
-        </w:rPr>
-        <w:t>, chúng ta kiểm tra chính xác toán tử độ dài `.{8,}` của Regex có chạy đúng hay bị lỗi `Off-by-one` (`.{9,}` hoặ</w:t>
+        <w:t>+1=9, chúng ta kiểm tra chính xác toán tử độ dài `.{8,}` của Regex có chạy đúng hay bị lỗi `Off-by-one` (`.{9,}` hoặ</w:t>
       </w:r>
       <w:r>
         <w:rPr>
@@ -26156,6 +26163,45 @@
           <w:szCs w:val="20"/>
         </w:rPr>
         <w:t>ộ dài chứ không bị nhiễu bởi các điều kiện ký tự khác.</w:t>
+      </w:r>
+    </w:p>
+    <w:p>
+      <w:pPr>
+        <w:pStyle w:val="Heading5"/>
+        <w:rPr>
+          <w:rFonts w:ascii="Arial" w:hAnsi="Arial" w:cs="Arial"/>
+          <w:b/>
+          <w:i/>
+          <w:sz w:val="20"/>
+          <w:szCs w:val="20"/>
+        </w:rPr>
+      </w:pPr>
+      <w:r>
+        <w:rPr>
+          <w:rFonts w:ascii="Arial" w:hAnsi="Arial" w:cs="Arial"/>
+          <w:b/>
+          <w:i/>
+          <w:sz w:val="20"/>
+          <w:szCs w:val="20"/>
+        </w:rPr>
+        <w:t>AI Gap Analysis</w:t>
+      </w:r>
+    </w:p>
+    <w:p>
+      <w:pPr>
+        <w:rPr>
+          <w:rFonts w:ascii="Arial" w:hAnsi="Arial" w:cs="Arial"/>
+          <w:sz w:val="20"/>
+          <w:szCs w:val="20"/>
+        </w:rPr>
+      </w:pPr>
+      <w:r>
+        <w:rPr>
+          <w:rFonts w:ascii="Arial" w:hAnsi="Arial" w:cs="Arial"/>
+          <w:sz w:val="20"/>
+          <w:szCs w:val="20"/>
+        </w:rPr>
+        <w:t>Đã kiểm tra, crosscheck và xác nhận AI Gemini đã cover rất tốt với các test case, không lọt bug.</w:t>
       </w:r>
     </w:p>
     <w:p>
@@ -26360,10 +26406,12 @@
             <w:r>
               <w:rPr>
                 <w:rFonts w:ascii="Arial" w:hAnsi="Arial" w:cs="Arial"/>
+                <w:b/>
+                <w:bCs/>
                 <w:noProof/>
                 <w:webHidden/>
               </w:rPr>
-              <w:t>1</w:t>
+              <w:t>Error! Bookmark not defined.</w:t>
             </w:r>
             <w:r>
               <w:rPr>
@@ -26437,10 +26485,12 @@
             <w:r>
               <w:rPr>
                 <w:rFonts w:ascii="Arial" w:hAnsi="Arial" w:cs="Arial"/>
+                <w:b/>
+                <w:bCs/>
                 <w:noProof/>
                 <w:webHidden/>
               </w:rPr>
-              <w:t>11</w:t>
+              <w:t>Error! Bookmark not defined.</w:t>
             </w:r>
             <w:r>
               <w:rPr>
@@ -26514,10 +26564,12 @@
             <w:r>
               <w:rPr>
                 <w:rFonts w:ascii="Arial" w:hAnsi="Arial" w:cs="Arial"/>
+                <w:b/>
+                <w:bCs/>
                 <w:noProof/>
                 <w:webHidden/>
               </w:rPr>
-              <w:t>17</w:t>
+              <w:t>Error! Bookmark not defined.</w:t>
             </w:r>
             <w:r>
               <w:rPr>
@@ -26591,10 +26643,12 @@
             <w:r>
               <w:rPr>
                 <w:rFonts w:ascii="Arial" w:hAnsi="Arial" w:cs="Arial"/>
+                <w:b/>
+                <w:bCs/>
                 <w:noProof/>
                 <w:webHidden/>
               </w:rPr>
-              <w:t>19</w:t>
+              <w:t>Error! Bookmark not defined.</w:t>
             </w:r>
             <w:r>
               <w:rPr>
@@ -26668,10 +26722,12 @@
             <w:r>
               <w:rPr>
                 <w:rFonts w:ascii="Arial" w:hAnsi="Arial" w:cs="Arial"/>
+                <w:b/>
+                <w:bCs/>
                 <w:noProof/>
                 <w:webHidden/>
               </w:rPr>
-              <w:t>50</w:t>
+              <w:t>Error! Bookmark not defined.</w:t>
             </w:r>
             <w:r>
               <w:rPr>
@@ -26748,7 +26804,7 @@
                 <w:noProof/>
                 <w:webHidden/>
               </w:rPr>
-              <w:t>51</w:t>
+              <w:t>17</w:t>
             </w:r>
             <w:r>
               <w:rPr>
@@ -26825,7 +26881,7 @@
                 <w:noProof/>
                 <w:webHidden/>
               </w:rPr>
-              <w:t>51</w:t>
+              <w:t>17</w:t>
             </w:r>
             <w:r>
               <w:rPr>
@@ -26850,7 +26906,6 @@
               <w:bCs/>
               <w:noProof/>
             </w:rPr>
-            <w:lastRenderedPageBreak/>
             <w:fldChar w:fldCharType="end"/>
           </w:r>
         </w:p>
@@ -45840,7 +45895,7 @@
 </file>
 
 <file path=customXml/itemProps1.xml><?xml version="1.0" encoding="utf-8"?>
-<ds:datastoreItem xmlns:ds="http://schemas.openxmlformats.org/officeDocument/2006/customXml" ds:itemID="{A47D8696-E5D0-40D6-8466-A6470179AFA0}">
+<ds:datastoreItem xmlns:ds="http://schemas.openxmlformats.org/officeDocument/2006/customXml" ds:itemID="{1DD8971B-0CFC-4F3A-AFC8-18CCE2815F49}">
   <ds:schemaRefs>
     <ds:schemaRef ds:uri="http://schemas.openxmlformats.org/officeDocument/2006/bibliography"/>
   </ds:schemaRefs>

</xml_diff>

<commit_message>
downloaded  appendices, add ai gap analysis to mainreport
</commit_message>
<xml_diff>
--- a/submission/reports/MainReport.docx
+++ b/submission/reports/MainReport.docx
@@ -26394,13 +26394,6 @@
                 <w:noProof/>
                 <w:webHidden/>
               </w:rPr>
-            </w:r>
-            <w:r>
-              <w:rPr>
-                <w:rFonts w:ascii="Arial" w:hAnsi="Arial" w:cs="Arial"/>
-                <w:noProof/>
-                <w:webHidden/>
-              </w:rPr>
               <w:fldChar w:fldCharType="separate"/>
             </w:r>
             <w:r>
@@ -26473,13 +26466,6 @@
                 <w:noProof/>
                 <w:webHidden/>
               </w:rPr>
-            </w:r>
-            <w:r>
-              <w:rPr>
-                <w:rFonts w:ascii="Arial" w:hAnsi="Arial" w:cs="Arial"/>
-                <w:noProof/>
-                <w:webHidden/>
-              </w:rPr>
               <w:fldChar w:fldCharType="separate"/>
             </w:r>
             <w:r>
@@ -26552,13 +26538,6 @@
                 <w:noProof/>
                 <w:webHidden/>
               </w:rPr>
-            </w:r>
-            <w:r>
-              <w:rPr>
-                <w:rFonts w:ascii="Arial" w:hAnsi="Arial" w:cs="Arial"/>
-                <w:noProof/>
-                <w:webHidden/>
-              </w:rPr>
               <w:fldChar w:fldCharType="separate"/>
             </w:r>
             <w:r>
@@ -26631,13 +26610,6 @@
                 <w:noProof/>
                 <w:webHidden/>
               </w:rPr>
-            </w:r>
-            <w:r>
-              <w:rPr>
-                <w:rFonts w:ascii="Arial" w:hAnsi="Arial" w:cs="Arial"/>
-                <w:noProof/>
-                <w:webHidden/>
-              </w:rPr>
               <w:fldChar w:fldCharType="separate"/>
             </w:r>
             <w:r>
@@ -26703,13 +26675,6 @@
                 <w:webHidden/>
               </w:rPr>
               <w:instrText xml:space="preserve"> PAGEREF _Toc241626155 \h </w:instrText>
-            </w:r>
-            <w:r>
-              <w:rPr>
-                <w:rFonts w:ascii="Arial" w:hAnsi="Arial" w:cs="Arial"/>
-                <w:noProof/>
-                <w:webHidden/>
-              </w:rPr>
             </w:r>
             <w:r>
               <w:rPr>
@@ -45895,7 +45860,7 @@
 </file>
 
 <file path=customXml/itemProps1.xml><?xml version="1.0" encoding="utf-8"?>
-<ds:datastoreItem xmlns:ds="http://schemas.openxmlformats.org/officeDocument/2006/customXml" ds:itemID="{1DD8971B-0CFC-4F3A-AFC8-18CCE2815F49}">
+<ds:datastoreItem xmlns:ds="http://schemas.openxmlformats.org/officeDocument/2006/customXml" ds:itemID="{A15DC7D6-E045-4754-9618-6207D56D6722}">
   <ds:schemaRefs>
     <ds:schemaRef ds:uri="http://schemas.openxmlformats.org/officeDocument/2006/bibliography"/>
   </ds:schemaRefs>

</xml_diff>